<commit_message>
25% DTV consistency sweep: INS-303 v1.2 + checklist + INS-301 ref + site + both one-pagers; Markup Review Sheet retitled with per-document labels; 23 PDF pages verified; site re-audited; rev 56
</commit_message>
<xml_diff>
--- a/02_PROGRAM/INS-303_Investor_Guide.docx
+++ b/02_PROGRAM/INS-303_Investor_Guide.docx
@@ -20,7 +20,7 @@
           <w:bCs/>
           <w:b/>
         </w:rPr>
-        <w:t xml:space="preserve">Banks, Private Credit, and Note Purchasers. Version 1.1, July 20, 2026, prepared for the founder’s review. This manual builds out the approved INS-303 outline of July 12 and carries the answer to program question 10, given July 13: each project or annexation issues its own note; the warehouse line and the credit facility are one instrument; and that facility funds every origination until the optional pooled bond take-out at portfolio stabilization. Every chapter is marked PUBLIC, meaning it may sit on the open website, or PORTAL, meaning it belongs behind credentials with the deal documents. Two chapters carry a bond counsel gate: Chapter 4 on credit enhancement and the waterfall detail inside Chapter 5 are structural placeholders that state what is settled and name precisely what is not, because those terms are set by counsel and by the first term sheet, not by marketing copy. Every factual claim traces to the INSITE Claims Register; the entry codes appear in Appendix A. Figures labeled founder estimate are the founder’s working numbers and are not commitments. No note has closed and no purchaser is committed.</w:t>
+        <w:t xml:space="preserve">Banks, Private Credit, and Note Purchasers. Version 1.2, July 23, 2026, prepared for the founder’s review. This manual builds out the approved INS-303 outline of July 12 and carries the answer to program question 10, given July 13: each project or annexation issues its own note; the warehouse line and the credit facility are one instrument; and that facility funds every origination until the optional pooled bond take-out at portfolio stabilization. Every chapter is marked PUBLIC, meaning it may sit on the open website, or PORTAL, meaning it belongs behind credentials with the deal documents. Two chapters carry a bond counsel gate: Chapter 4 on credit enhancement and the waterfall detail inside Chapter 5 are structural placeholders that state what is settled and name precisely what is not, because those terms are set by counsel and by the first term sheet, not by marketing copy. Every factual claim traces to the INSITE Claims Register; the entry codes appear in Appendix A. Figures labeled founder estimate are the founder’s working numbers and are not commitments. No note has closed and no purchaser is committed.</w:t>
       </w:r>
     </w:p>
     <w:bookmarkStart w:id="23" w:name="part-i-the-program-and-the-paper"/>
@@ -300,7 +300,7 @@
         <w:t xml:space="preserve"> </w:t>
       </w:r>
       <w:r>
-        <w:t xml:space="preserve">PUBLIC. A qualifying project applies through the developer intake and eligibility manual (INS-202) and the standard data package (INS-201, whose fields mirror what BOLD’s own developer application collects, G21). Underwriting sizes the note against an independent MAI appraisal performed to the standards the California Debt and Investment Advisory Commission publishes, and against the program’s four-to-one value-to-lien policy (A2, A3). The issuer’s council approves the annexation on its regular calendar. The landowner’s unanimous approval is signed and notarized. The amendment to the notice of special tax lien is recorded. No funding occurs before recording is confirmed (INS-401, Stage 6).</w:t>
+        <w:t xml:space="preserve">PUBLIC. A qualifying project applies through the developer intake and eligibility manual (INS-202) and the standard data package (INS-201, whose fields mirror what BOLD’s own developer application collects, G21). Underwriting sizes the note against an independent MAI appraisal performed to the standards the California Debt and Investment Advisory Commission publishes, and against the program’s cap of 25 percent debt to appraised value (A2, A3). The issuer’s council approves the annexation on its regular calendar. The landowner’s unanimous approval is signed and notarized. The amendment to the notice of special tax lien is recorded. No funding occurs before recording is confirmed (INS-401, Stage 6).</w:t>
       </w:r>
     </w:p>
     <w:p>
@@ -442,7 +442,7 @@
         <w:pStyle w:val="Compact"/>
       </w:pPr>
       <w:r>
-        <w:t xml:space="preserve">The four-to-one appraised value-to-lien cushion, an INSITE program policy above the statutory three-to-one condition of section 53345.8, matching CSCDA’s own adopted policy (A2, A3).</w:t>
+        <w:t xml:space="preserve">Debt capped at 25 percent of appraised value, an INSITE program policy stricter than the statutory three-to-one condition of section 53345.8, matching CSCDA’s own adopted policy (A2, A3).</w:t>
       </w:r>
     </w:p>
     <w:p>
@@ -548,13 +548,13 @@
           <w:bCs/>
           <w:b/>
         </w:rPr>
-        <w:t xml:space="preserve">5.3 The four-to-one test in practice.</w:t>
-      </w:r>
-      <w:r>
-        <w:t xml:space="preserve"> </w:t>
-      </w:r>
-      <w:r>
-        <w:t xml:space="preserve">PUBLIC. Before notes are sold, the issuer must find the taxed property worth at least three times the debt (section 53345.8, A2). INSITE requires four. The value comes from an independent MAI appraiser on a standing panel, never an INSITE employee, working to the program’s written appraisal manual (INS-101) and to CDIAC’s land-secured standards (F5, second entry).</w:t>
+        <w:t xml:space="preserve">5.3 The 25 percent debt-to-value test in practice.</w:t>
+      </w:r>
+      <w:r>
+        <w:t xml:space="preserve"> </w:t>
+      </w:r>
+      <w:r>
+        <w:t xml:space="preserve">PUBLIC. Before notes are sold, the issuer must find the taxed property worth at least three times the debt, meaning debt of roughly a third of value (section 53345.8, A2). INSITE caps debt at 25 percent of appraised value. The value comes from an independent MAI appraiser on a standing panel, never an INSITE employee, working to the program’s written appraisal manual (INS-101) and to CDIAC’s land-secured standards (F5, second entry).</w:t>
       </w:r>
     </w:p>
     <w:p>
@@ -618,7 +618,7 @@
         <w:t xml:space="preserve"> </w:t>
       </w:r>
       <w:r>
-        <w:t xml:space="preserve">PUBLIC. Four things gate every deal: the appraisal and the four-to-one cushion; the total tax burden against the 2 percent benchmark and the issuer’s own cap; the completeness of the developer’s data package under INS-201; and the eligibility of the fees themselves. School fees are excluded at launch, definitely, as standing program policy (F2). The founder is researching whether a pay-then-reimburse structure avoids involving the school district at all; the register’s Riverside precedent suggests a thin joint community facilities agreement survives even under reimbursement (G7), and bond counsel resolves the question if it is ever reopened.</w:t>
+        <w:t xml:space="preserve">PUBLIC. Four things gate every deal: the appraisal and the 25 percent debt-to-value cap; the total tax burden against the 2 percent benchmark and the issuer’s own cap; the completeness of the developer’s data package under INS-201; and the eligibility of the fees themselves. School fees are excluded at launch, definitely, as standing program policy (F2). The founder is researching whether a pay-then-reimburse structure avoids involving the school district at all; the register’s Riverside precedent suggests a thin joint community facilities agreement survives even under reimbursement (G7), and bond counsel resolves the question if it is ever reopened.</w:t>
       </w:r>
     </w:p>
     <w:p>
@@ -636,7 +636,7 @@
         <w:t xml:space="preserve"> </w:t>
       </w:r>
       <w:r>
-        <w:t xml:space="preserve">PUBLIC. An appraisal that will not support four-to-one at the requested note size. A burden that breaks the cap once the special tax is stacked on the existing ad valorem bill. A title condition or an existing special tax or assessment that changes the lien position. A fee schedule that has moved between application and closing. Each of these stops the file rather than shrinking the cushion.</w:t>
+        <w:t xml:space="preserve">PUBLIC. An appraisal that will not keep debt inside 25 percent of value at the requested note size. A burden that breaks the cap once the special tax is stacked on the existing ad valorem bill. A title condition or an existing special tax or assessment that changes the lien position. A fee schedule that has moved between application and closing. Each of these stops the file rather than shrinking the cushion.</w:t>
       </w:r>
     </w:p>
     <w:p>
@@ -1278,7 +1278,7 @@
               <w:jc w:val="left"/>
             </w:pPr>
             <w:r>
-              <w:t xml:space="preserve">Four-to-one is INSITE program policy, with CSCDA’s own adopted policy as precedent</w:t>
+              <w:t xml:space="preserve">The 25 percent debt-to-value cap (four-to-one value-to-lien) is INSITE program policy, with CSCDA’s own adopted policy as precedent</w:t>
             </w:r>
           </w:p>
         </w:tc>

</xml_diff>